<commit_message>
docs(appli-ia): leçon 02 — corrections fondues dans le texte, trace en fin de document
Les corrections du commit précédent étaient signalées par des incises
« ⚠️ Mise à jour du 09/08 » au fil du texte, qui hachaient la lecture
pour quelqu'un découvrant la leçon.

- les six passages sont réécrits comme s'ils avaient toujours été justes
- le piège n°2 garde sa valeur pédagogique en démontant l'idée reçue
  (« ça casse sur Windows » est faux) plutôt qu'en se corrigeant lui-même
- le nombre de requêtes gagne une invitation à les compter soi-même
  dans l'onglet Réseau
- l'étape 4 du cycle requête-réponse est mise en cohérence : le
  navigateur télécharge le CSS et les modules avant de les exécuter
- nouvel encadré final « Journal des corrections » : les 5 points, avec
  la formulation d'origine citée et ce qui a été vérifié sans changement

Co-Authored-By: Claude Opus 5 <noreply@anthropic.com>
</commit_message>
<xml_diff>
--- a/livrables/lecons/2026-08-07_lecon-appli-ia_02_socle-web-premier-ecran.docx
+++ b/livrables/lecons/2026-08-07_lecon-appli-ia_02_socle-web-premier-ecran.docx
@@ -393,7 +393,7 @@
           <w:sz w:val="22"/>
           <w:szCs w:val="22"/>
         </w:rPr>
-        <w:t xml:space="preserve">JavaScript gère le COMPORTEMENT : réagir au clic, modifier la page sans la recharger, aller chercher des données sur le serveur. Dans le Portail, c'est api.js qui appelle fetch('/api/inventaire') et rendu.js qui construit les cartes ; app.js se contente d'enchaîner les deux. ⚠️ Mise à jour du 09/08/2026 : au moment de la rédaction, tout cela tenait dans un bloc &lt;script&gt; à l'intérieur d'index.html. Le code a été extrait puis découpé en modules le 09/08 ; index.html ne contient plus que la structure.</w:t>
+        <w:t xml:space="preserve">JavaScript gère le COMPORTEMENT : réagir au clic, modifier la page sans la recharger, aller chercher des données sur le serveur. Dans le Portail, ce travail est réparti sur trois fichiers : api.js appelle fetch('/api/inventaire'), rendu.js construit les cartes, et app.js se contente d'enchaîner les deux. index.html, lui, ne décrit plus que la structure.</w:t>
       </w:r>
     </w:p>
     <w:p>
@@ -604,7 +604,7 @@
           <w:sz w:val="22"/>
           <w:szCs w:val="22"/>
         </w:rPr>
-        <w:t xml:space="preserve">le navigateur interprète le HTML, charge le CSS, exécute le JS, qui lui-même envoie une deuxième requête vers /api/inventaire.</w:t>
+        <w:t xml:space="preserve">le navigateur interprète le HTML, télécharge le CSS et les modules JavaScript qu'il déclare, puis exécute ces derniers — qui envoient à leur tour une requête vers /api/inventaire.</w:t>
       </w:r>
     </w:p>
     <w:p>
@@ -630,7 +630,7 @@
           <w:sz w:val="22"/>
           <w:szCs w:val="22"/>
         </w:rPr>
-        <w:t xml:space="preserve">Deux requêtes pour afficher une page, c'est normal et délibéré : la première charge la structure, la seconde charge les données. C'est le pattern qu'on retrouvera jusqu'en leçon 08. ⚠️ Mise à jour du 09/08/2026 : depuis l'extraction du CSS et du JavaScript, la page en déclenche SIX, mesurées dans le navigateur — /, style.css, app.js, api.js, rendu.js, puis /api/inventaire. Le principe ne change pas, il se précise : une requête pour la structure, autant que nécessaire pour les ressources qu'elle déclare, une dernière pour les données.</w:t>
+        <w:t xml:space="preserve">Six requêtes pour afficher une page, c'est normal et délibéré : /, puis style.css, app.js, api.js et rendu.js, puis /api/inventaire. Une requête pour la structure, autant que nécessaire pour les ressources qu'elle déclare, une dernière pour les données. Compte-les toi-même dans l'onglet Réseau des outils de développement (F12) : c'est le meilleur moyen de vérifier que tu as compris ce qui se passe. C'est le pattern qu'on retrouvera jusqu'en leçon 08.</w:t>
       </w:r>
     </w:p>
     <w:p>
@@ -1022,7 +1022,7 @@
           <w:sz w:val="22"/>
           <w:szCs w:val="22"/>
         </w:rPr>
-        <w:t xml:space="preserve">path.join() NORMALISE le chemin obtenu : path.join('a/', '/b') donne 'a/b' là où la concaténation produit 'a//b', et les segments '.' et '..' sont résolus au passage. ⚠️ Correction du 09/08/2026 : cette leçon affirmait au départ que « sur Windows, le séparateur est \ » et que « __dirname + '/public' casse sur Windows ». C'est FAUX, et vérifiable en une ligne sur un poste Windows. La documentation officielle de Node.js (module path, section path.sep) indique que Windows accepte les DEUX séparateurs en ENTRÉE, et n'impose la barre oblique inverse qu'en SORTIE. Le conseil reste bon, mais sa justification était mauvaise : on utilise path.join() pour la normalisation, pas pour la portabilité.</w:t>
+        <w:t xml:space="preserve">path.join() NORMALISE le chemin obtenu : path.join('a/', '/b') donne 'a/b' là où la concaténation produit 'a//b', et les segments '.' et '..' sont résolus au passage. Attention à l'argument que l'on lit partout, y compris sous la plume d'une IA : « ça casse sur Windows » est FAUX. La documentation officielle de Node.js (module path, section path.sep) indique que Windows accepte les DEUX séparateurs en ENTRÉE, et n'impose la barre oblique inverse qu'en SORTIE. __dirname + '/public' fonctionne donc très bien sous Windows. La vraie raison d'utiliser path.join() est la normalisation, pas la portabilité — et savoir distinguer les deux t'évitera de propager une idée reçue.</w:t>
       </w:r>
     </w:p>
     <w:p>
@@ -2748,7 +2748,7 @@
           <w:sz w:val="22"/>
           <w:szCs w:val="22"/>
         </w:rPr>
-        <w:t xml:space="preserve">Dans public/rendu.js, après avoir reçu les données de l'API, calcule et affiche dans &lt;footer&gt; le nombre total de livrables (somme des info.nombre de toutes les catégories) et leur poids total en Mo (somme des info.taille_ko / 1024, arrondie à 1 décimale). Critère de réussite : le pied de page affiche quelque chose comme « 210 livrables · 54,3 Mo — chargé à 08:15:32 ». (Énoncé du 07/08 : « dans index.html » — le code a été découpé le 09/08. Ce challenge est RÉSOLU : voir la fonction afficherTotaux() de rendu.js.)</w:t>
+        <w:t xml:space="preserve">Dans public/rendu.js, après avoir reçu les données de l'API, calcule et affiche dans &lt;footer&gt; le nombre total de livrables (somme des info.nombre de toutes les catégories) et leur poids total en Mo (somme des info.taille_ko / 1024, arrondie à 1 décimale). Critère de réussite : le pied de page affiche quelque chose comme « 210 livrables · 54,3 Mo — chargé à 08:15:32 ». Ce challenge est déjà résolu dans le projet : va lire la fonction afficherTotaux() de rendu.js avant de le refaire toi-même.</w:t>
       </w:r>
     </w:p>
     <w:p>
@@ -2992,7 +2992,7 @@
           <w:sz w:val="22"/>
           <w:szCs w:val="22"/>
         </w:rPr>
-        <w:t xml:space="preserve">Pré-requis : avoir complété au moins un des challenges de cette leçon, pour être à l'aise avec la structure du code existant. La leçon 03 s'appuiera sur le code tel qu'il est à l'issue de la leçon 02 ET des refactorisations du 09/08/2026 : scripts/serveur.js côté serveur, et cinq fichiers côté navigateur — index.html (structure seule), style.css (apparence), app.js (orchestration), api.js (accès aux données), rendu.js (affichage).</w:t>
+        <w:t xml:space="preserve">Pré-requis : avoir complété au moins un des challenges de cette leçon, pour être à l'aise avec la structure du code existant. La leçon 03 s'appuiera sur le code tel qu'il est à l'issue de la leçon 02 : scripts/serveur.js côté serveur, et cinq fichiers côté navigateur — index.html (structure seule), style.css (apparence), app.js (orchestration), api.js (accès aux données), rendu.js (affichage).</w:t>
       </w:r>
     </w:p>
     <w:p>
@@ -3001,6 +3001,249 @@
       </w:pPr>
       <w:r>
         <w:t xml:space="preserve"/>
+      </w:r>
+    </w:p>
+    <w:p>
+      <w:pPr>
+        <w:pStyle w:val="Heading2"/>
+        <w:spacing w:after="120" w:before="320"/>
+      </w:pPr>
+      <w:r>
+        <w:rPr>
+          <w:rFonts w:ascii="Times New Roman" w:cs="Times New Roman" w:eastAsia="Times New Roman" w:hAnsi="Times New Roman"/>
+          <w:b/>
+          <w:bCs/>
+          <w:color w:val="1B3A6B"/>
+          <w:sz w:val="30"/>
+          <w:szCs w:val="30"/>
+        </w:rPr>
+        <w:t xml:space="preserve">📝 Journal des corrections</w:t>
+      </w:r>
+    </w:p>
+    <w:p>
+      <w:pPr>
+        <w:pBdr>
+          <w:left w:val="single" w:color="1B3A6B" w:sz="6"/>
+        </w:pBdr>
+        <w:shd w:fill="EEF2F7" w:val="clear"/>
+        <w:spacing w:after="40" w:before="80"/>
+        <w:ind w:left="200"/>
+      </w:pPr>
+      <w:r>
+        <w:rPr>
+          <w:rFonts w:ascii="Times New Roman" w:cs="Times New Roman" w:eastAsia="Times New Roman" w:hAnsi="Times New Roman"/>
+          <w:sz w:val="20"/>
+          <w:szCs w:val="20"/>
+        </w:rPr>
+        <w:t xml:space="preserve">Cette leçon a été produite le 07/08/2026 et relue le 09/08/2026. Les corrections sont fondues dans le texte ci-dessus. La formulation d'origine est conservée ici, pour que rien ne se perde entre les deux versions.</w:t>
+      </w:r>
+    </w:p>
+    <w:p>
+      <w:pPr>
+        <w:pBdr>
+          <w:left w:val="single" w:color="1B3A6B" w:sz="6"/>
+        </w:pBdr>
+        <w:shd w:fill="EEF2F7" w:val="clear"/>
+        <w:spacing w:after="40" w:before="120"/>
+        <w:ind w:left="200"/>
+      </w:pPr>
+      <w:r>
+        <w:rPr>
+          <w:rFonts w:ascii="Times New Roman" w:cs="Times New Roman" w:eastAsia="Times New Roman" w:hAnsi="Times New Roman"/>
+          <w:b/>
+          <w:bCs/>
+          <w:sz w:val="20"/>
+          <w:szCs w:val="20"/>
+        </w:rPr>
+        <w:t xml:space="preserve">1. Piège n°2 — chemins en dur.</w:t>
+      </w:r>
+    </w:p>
+    <w:p>
+      <w:pPr>
+        <w:pBdr>
+          <w:left w:val="single" w:color="1B3A6B" w:sz="6"/>
+        </w:pBdr>
+        <w:shd w:fill="EEF2F7" w:val="clear"/>
+        <w:spacing w:after="40" w:before="40"/>
+        <w:ind w:left="200"/>
+      </w:pPr>
+      <w:r>
+        <w:rPr>
+          <w:rFonts w:ascii="Times New Roman" w:cs="Times New Roman" w:eastAsia="Times New Roman" w:hAnsi="Times New Roman"/>
+          <w:sz w:val="20"/>
+          <w:szCs w:val="20"/>
+        </w:rPr>
+        <w:t xml:space="preserve">Version initiale : « Sur Windows, le séparateur est \ ; path.join() gère cela automatiquement. __dirname + '/public' casse sur Windows. » Affirmation erronée, sans rapport avec l'évolution du code : la documentation Node.js (module path, section path.sep) indique que Windows accepte les deux séparateurs en entrée. Le conseil d'utiliser path.join() est conservé ; sa justification est désormais la normalisation des chemins.</w:t>
+      </w:r>
+    </w:p>
+    <w:p>
+      <w:pPr>
+        <w:pBdr>
+          <w:left w:val="single" w:color="1B3A6B" w:sz="6"/>
+        </w:pBdr>
+        <w:shd w:fill="EEF2F7" w:val="clear"/>
+        <w:spacing w:after="40" w:before="120"/>
+        <w:ind w:left="200"/>
+      </w:pPr>
+      <w:r>
+        <w:rPr>
+          <w:rFonts w:ascii="Times New Roman" w:cs="Times New Roman" w:eastAsia="Times New Roman" w:hAnsi="Times New Roman"/>
+          <w:b/>
+          <w:bCs/>
+          <w:sz w:val="20"/>
+          <w:szCs w:val="20"/>
+        </w:rPr>
+        <w:t xml:space="preserve">2. Nombre de requêtes.</w:t>
+      </w:r>
+    </w:p>
+    <w:p>
+      <w:pPr>
+        <w:pBdr>
+          <w:left w:val="single" w:color="1B3A6B" w:sz="6"/>
+        </w:pBdr>
+        <w:shd w:fill="EEF2F7" w:val="clear"/>
+        <w:spacing w:after="40" w:before="40"/>
+        <w:ind w:left="200"/>
+      </w:pPr>
+      <w:r>
+        <w:rPr>
+          <w:rFonts w:ascii="Times New Roman" w:cs="Times New Roman" w:eastAsia="Times New Roman" w:hAnsi="Times New Roman"/>
+          <w:sz w:val="20"/>
+          <w:szCs w:val="20"/>
+        </w:rPr>
+        <w:t xml:space="preserve">Version initiale : « Deux requêtes pour afficher une page ». Exact au 07/08, quand le CSS et le JavaScript étaient écrits à l'intérieur d'index.html. Leur extraction, le 09/08, porte le total à six — vérifié dans le navigateur.</w:t>
+      </w:r>
+    </w:p>
+    <w:p>
+      <w:pPr>
+        <w:pBdr>
+          <w:left w:val="single" w:color="1B3A6B" w:sz="6"/>
+        </w:pBdr>
+        <w:shd w:fill="EEF2F7" w:val="clear"/>
+        <w:spacing w:after="40" w:before="120"/>
+        <w:ind w:left="200"/>
+      </w:pPr>
+      <w:r>
+        <w:rPr>
+          <w:rFonts w:ascii="Times New Roman" w:cs="Times New Roman" w:eastAsia="Times New Roman" w:hAnsi="Times New Roman"/>
+          <w:b/>
+          <w:bCs/>
+          <w:sz w:val="20"/>
+          <w:szCs w:val="20"/>
+        </w:rPr>
+        <w:t xml:space="preserve">3. Rôle du JavaScript.</w:t>
+      </w:r>
+    </w:p>
+    <w:p>
+      <w:pPr>
+        <w:pBdr>
+          <w:left w:val="single" w:color="1B3A6B" w:sz="6"/>
+        </w:pBdr>
+        <w:shd w:fill="EEF2F7" w:val="clear"/>
+        <w:spacing w:after="40" w:before="40"/>
+        <w:ind w:left="200"/>
+      </w:pPr>
+      <w:r>
+        <w:rPr>
+          <w:rFonts w:ascii="Times New Roman" w:cs="Times New Roman" w:eastAsia="Times New Roman" w:hAnsi="Times New Roman"/>
+          <w:sz w:val="20"/>
+          <w:szCs w:val="20"/>
+        </w:rPr>
+        <w:t xml:space="preserve">Version initiale : « Dans index.html, c'est le bloc &lt;script&gt; qui appelle fetch('/api/inventaire') et construit les cartes dynamiquement. » Ce bloc a été extrait le 09/08, puis découpé en trois modules : app.js, api.js et rendu.js.</w:t>
+      </w:r>
+    </w:p>
+    <w:p>
+      <w:pPr>
+        <w:pBdr>
+          <w:left w:val="single" w:color="1B3A6B" w:sz="6"/>
+        </w:pBdr>
+        <w:shd w:fill="EEF2F7" w:val="clear"/>
+        <w:spacing w:after="40" w:before="120"/>
+        <w:ind w:left="200"/>
+      </w:pPr>
+      <w:r>
+        <w:rPr>
+          <w:rFonts w:ascii="Times New Roman" w:cs="Times New Roman" w:eastAsia="Times New Roman" w:hAnsi="Times New Roman"/>
+          <w:b/>
+          <w:bCs/>
+          <w:sz w:val="20"/>
+          <w:szCs w:val="20"/>
+        </w:rPr>
+        <w:t xml:space="preserve">4. Les trois challenges.</w:t>
+      </w:r>
+    </w:p>
+    <w:p>
+      <w:pPr>
+        <w:pBdr>
+          <w:left w:val="single" w:color="1B3A6B" w:sz="6"/>
+        </w:pBdr>
+        <w:shd w:fill="EEF2F7" w:val="clear"/>
+        <w:spacing w:after="40" w:before="40"/>
+        <w:ind w:left="200"/>
+      </w:pPr>
+      <w:r>
+        <w:rPr>
+          <w:rFonts w:ascii="Times New Roman" w:cs="Times New Roman" w:eastAsia="Times New Roman" w:hAnsi="Times New Roman"/>
+          <w:sz w:val="20"/>
+          <w:szCs w:val="20"/>
+        </w:rPr>
+        <w:t xml:space="preserve">Leur partie affichage renvoyait à index.html ; elle renvoie désormais à public/rendu.js. Le Challenge A est signalé comme déjà résolu ; B et C renvoient à leur découpage en 10 paliers progressifs. Anglicisme corrigé au passage dans l'énoncé du Challenge C : « (field taille) » est devenu « (champ taille) ».</w:t>
+      </w:r>
+    </w:p>
+    <w:p>
+      <w:pPr>
+        <w:pBdr>
+          <w:left w:val="single" w:color="1B3A6B" w:sz="6"/>
+        </w:pBdr>
+        <w:shd w:fill="EEF2F7" w:val="clear"/>
+        <w:spacing w:after="40" w:before="120"/>
+        <w:ind w:left="200"/>
+      </w:pPr>
+      <w:r>
+        <w:rPr>
+          <w:rFonts w:ascii="Times New Roman" w:cs="Times New Roman" w:eastAsia="Times New Roman" w:hAnsi="Times New Roman"/>
+          <w:b/>
+          <w:bCs/>
+          <w:sz w:val="20"/>
+          <w:szCs w:val="20"/>
+        </w:rPr>
+        <w:t xml:space="preserve">5. Prérequis de la leçon 03.</w:t>
+      </w:r>
+    </w:p>
+    <w:p>
+      <w:pPr>
+        <w:pBdr>
+          <w:left w:val="single" w:color="1B3A6B" w:sz="6"/>
+        </w:pBdr>
+        <w:shd w:fill="EEF2F7" w:val="clear"/>
+        <w:spacing w:after="40" w:before="40"/>
+        <w:ind w:left="200"/>
+      </w:pPr>
+      <w:r>
+        <w:rPr>
+          <w:rFonts w:ascii="Times New Roman" w:cs="Times New Roman" w:eastAsia="Times New Roman" w:hAnsi="Times New Roman"/>
+          <w:sz w:val="20"/>
+          <w:szCs w:val="20"/>
+        </w:rPr>
+        <w:t xml:space="preserve">Version initiale : « les fichiers scripts/serveur.js et public/index.html tels qu'ils sont après la leçon 02 ». Le projet en compte six depuis le 09/08.</w:t>
+      </w:r>
+    </w:p>
+    <w:p>
+      <w:pPr>
+        <w:pBdr>
+          <w:left w:val="single" w:color="1B3A6B" w:sz="6"/>
+        </w:pBdr>
+        <w:shd w:fill="EEF2F7" w:val="clear"/>
+        <w:spacing w:after="80" w:before="140"/>
+        <w:ind w:left="200"/>
+      </w:pPr>
+      <w:r>
+        <w:rPr>
+          <w:rFonts w:ascii="Times New Roman" w:cs="Times New Roman" w:eastAsia="Times New Roman" w:hAnsi="Times New Roman"/>
+          <w:sz w:val="20"/>
+          <w:szCs w:val="20"/>
+        </w:rPr>
+        <w:t xml:space="preserve">Vérifié lors de la relecture et inchangé : Node v24.15.0, préfixe node: disponible depuis v14.18.0 et v16.0.0, définition de RACINE, correction des écarts n°1 et n°2, 6 catégories affichées, 89 leçons comptées, et les 4 URLs de la bibliographie.</w:t>
       </w:r>
     </w:p>
     <w:p>

</xml_diff>